<commit_message>
Informe con información completa del refactor
</commit_message>
<xml_diff>
--- a/Algoritmos III.docx
+++ b/Algoritmos III.docx
@@ -454,22 +454,538 @@
         <w:rPr>
           <w:sz w:val="28"/>
           <w:szCs w:val="28"/>
+        </w:rPr>
+      </w:pPr>
+      <w:r>
+        <w:rPr>
+          <w:sz w:val="28"/>
+          <w:szCs w:val="28"/>
+        </w:rPr>
+        <w:br w:type="page"/>
+      </w:r>
+    </w:p>
+    <w:p>
+      <w:pPr>
+        <w:rPr>
+          <w:sz w:val="28"/>
+          <w:szCs w:val="28"/>
+        </w:rPr>
+      </w:pPr>
+    </w:p>
+    <w:p>
+      <w:pPr>
+        <w:rPr>
+          <w:sz w:val="28"/>
+          <w:szCs w:val="28"/>
+        </w:rPr>
+      </w:pPr>
+    </w:p>
+    <w:p>
+      <w:pPr>
+        <w:rPr>
+          <w:rFonts w:ascii="Traditional Arabic" w:hAnsi="Traditional Arabic" w:cs="Traditional Arabic"/>
+          <w:sz w:val="56"/>
+          <w:szCs w:val="56"/>
+        </w:rPr>
+      </w:pPr>
+      <w:r>
+        <w:rPr>
+          <w:rFonts w:ascii="Traditional Arabic" w:hAnsi="Traditional Arabic" w:cs="Traditional Arabic" w:hint="cs"/>
+          <w:b/>
+          <w:bCs/>
+          <w:sz w:val="56"/>
+          <w:szCs w:val="56"/>
+        </w:rPr>
+        <w:t>Índice</w:t>
+      </w:r>
+    </w:p>
+    <w:p>
+      <w:pPr>
+        <w:rPr>
+          <w:rFonts w:ascii="Traditional Arabic" w:hAnsi="Traditional Arabic" w:cs="Traditional Arabic"/>
+          <w:sz w:val="28"/>
+          <w:szCs w:val="28"/>
+        </w:rPr>
+      </w:pPr>
+    </w:p>
+    <w:p>
+      <w:pPr>
+        <w:rPr>
+          <w:rFonts w:ascii="Traditional Arabic" w:hAnsi="Traditional Arabic" w:cs="Traditional Arabic"/>
+          <w:sz w:val="28"/>
+          <w:szCs w:val="28"/>
+        </w:rPr>
+      </w:pPr>
+      <w:r>
+        <w:rPr>
+          <w:rFonts w:ascii="Traditional Arabic" w:hAnsi="Traditional Arabic" w:cs="Traditional Arabic"/>
+          <w:b/>
+          <w:bCs/>
+          <w:sz w:val="40"/>
+          <w:szCs w:val="40"/>
+        </w:rPr>
+        <w:t>Refactor</w:t>
+      </w:r>
+      <w:r>
+        <w:rPr>
+          <w:rFonts w:ascii="Traditional Arabic" w:hAnsi="Traditional Arabic" w:cs="Traditional Arabic"/>
+          <w:sz w:val="28"/>
+          <w:szCs w:val="28"/>
+        </w:rPr>
+        <w:t>…………………………………………………………..</w:t>
+      </w:r>
+      <w:r>
+        <w:rPr>
+          <w:rFonts w:ascii="Traditional Arabic" w:hAnsi="Traditional Arabic" w:cs="Traditional Arabic"/>
+          <w:sz w:val="28"/>
+          <w:szCs w:val="28"/>
+        </w:rPr>
+        <w:t>3</w:t>
+      </w:r>
+    </w:p>
+    <w:p>
+      <w:pPr>
+        <w:rPr>
+          <w:rFonts w:ascii="Traditional Arabic" w:hAnsi="Traditional Arabic" w:cs="Traditional Arabic"/>
+          <w:sz w:val="28"/>
+          <w:szCs w:val="28"/>
+        </w:rPr>
+      </w:pPr>
+      <w:r>
+        <w:rPr>
+          <w:rFonts w:ascii="Traditional Arabic" w:hAnsi="Traditional Arabic" w:cs="Traditional Arabic"/>
+          <w:sz w:val="28"/>
+          <w:szCs w:val="28"/>
+        </w:rPr>
+        <w:tab/>
+      </w:r>
+      <w:r>
+        <w:rPr>
+          <w:rFonts w:ascii="Traditional Arabic" w:hAnsi="Traditional Arabic" w:cs="Traditional Arabic"/>
+          <w:b/>
+          <w:bCs/>
+          <w:sz w:val="32"/>
+          <w:szCs w:val="32"/>
+        </w:rPr>
+        <w:t>Builders</w:t>
+      </w:r>
+      <w:r>
+        <w:rPr>
+          <w:rFonts w:ascii="Traditional Arabic" w:hAnsi="Traditional Arabic" w:cs="Traditional Arabic"/>
+          <w:sz w:val="28"/>
+          <w:szCs w:val="28"/>
+        </w:rPr>
+        <w:t>………………………………………………...</w:t>
+      </w:r>
+      <w:r>
+        <w:rPr>
+          <w:rFonts w:ascii="Traditional Arabic" w:hAnsi="Traditional Arabic" w:cs="Traditional Arabic"/>
+          <w:sz w:val="28"/>
+          <w:szCs w:val="28"/>
+        </w:rPr>
+        <w:t>3</w:t>
+      </w:r>
+    </w:p>
+    <w:p>
+      <w:pPr>
+        <w:ind w:firstLine="708"/>
+        <w:rPr>
+          <w:rFonts w:ascii="Traditional Arabic" w:hAnsi="Traditional Arabic" w:cs="Traditional Arabic"/>
+          <w:sz w:val="28"/>
+          <w:szCs w:val="28"/>
+        </w:rPr>
+      </w:pPr>
+      <w:r>
+        <w:rPr>
+          <w:rFonts w:ascii="Traditional Arabic" w:hAnsi="Traditional Arabic" w:cs="Traditional Arabic"/>
+          <w:b/>
+          <w:bCs/>
+          <w:sz w:val="32"/>
+          <w:szCs w:val="32"/>
+        </w:rPr>
+        <w:t>Jugada</w:t>
+      </w:r>
+      <w:r>
+        <w:rPr>
+          <w:rFonts w:ascii="Traditional Arabic" w:hAnsi="Traditional Arabic" w:cs="Traditional Arabic"/>
+          <w:sz w:val="28"/>
+          <w:szCs w:val="28"/>
+        </w:rPr>
+        <w:t>...</w:t>
+      </w:r>
+      <w:r>
+        <w:rPr>
+          <w:rFonts w:ascii="Traditional Arabic" w:hAnsi="Traditional Arabic" w:cs="Traditional Arabic"/>
+          <w:sz w:val="28"/>
+          <w:szCs w:val="28"/>
+        </w:rPr>
+        <w:t>………………………………………………...</w:t>
+      </w:r>
+      <w:r>
+        <w:rPr>
+          <w:rFonts w:ascii="Traditional Arabic" w:hAnsi="Traditional Arabic" w:cs="Traditional Arabic"/>
+          <w:sz w:val="28"/>
+          <w:szCs w:val="28"/>
+        </w:rPr>
+        <w:t>4</w:t>
+      </w:r>
+    </w:p>
+    <w:p>
+      <w:pPr>
+        <w:ind w:firstLine="708"/>
+        <w:rPr>
+          <w:rFonts w:ascii="Traditional Arabic" w:hAnsi="Traditional Arabic" w:cs="Traditional Arabic"/>
+          <w:sz w:val="28"/>
+          <w:szCs w:val="28"/>
+        </w:rPr>
+      </w:pPr>
+      <w:r>
+        <w:rPr>
+          <w:rFonts w:ascii="Traditional Arabic" w:hAnsi="Traditional Arabic" w:cs="Traditional Arabic"/>
+          <w:b/>
+          <w:bCs/>
+          <w:sz w:val="32"/>
+          <w:szCs w:val="32"/>
+        </w:rPr>
+        <w:t>Lógica de Eventos y Comandos</w:t>
+      </w:r>
+      <w:r>
+        <w:rPr>
+          <w:rFonts w:ascii="Traditional Arabic" w:hAnsi="Traditional Arabic" w:cs="Traditional Arabic"/>
+          <w:sz w:val="28"/>
+          <w:szCs w:val="28"/>
+        </w:rPr>
+        <w:t>……</w:t>
+      </w:r>
+      <w:r>
+        <w:rPr>
+          <w:rFonts w:ascii="Traditional Arabic" w:hAnsi="Traditional Arabic" w:cs="Traditional Arabic"/>
+          <w:sz w:val="28"/>
+          <w:szCs w:val="28"/>
+        </w:rPr>
+        <w:t>…………….4</w:t>
+      </w:r>
+    </w:p>
+    <w:p>
+      <w:pPr>
+        <w:ind w:firstLine="708"/>
+        <w:rPr>
+          <w:rFonts w:ascii="Traditional Arabic" w:hAnsi="Traditional Arabic" w:cs="Traditional Arabic"/>
+          <w:sz w:val="28"/>
+          <w:szCs w:val="28"/>
+        </w:rPr>
+      </w:pPr>
+      <w:r>
+        <w:rPr>
+          <w:rFonts w:ascii="Traditional Arabic" w:hAnsi="Traditional Arabic" w:cs="Traditional Arabic"/>
+          <w:sz w:val="28"/>
+          <w:szCs w:val="28"/>
+        </w:rPr>
+        <w:tab/>
+      </w:r>
+      <w:r>
+        <w:rPr>
+          <w:rFonts w:ascii="Traditional Arabic" w:hAnsi="Traditional Arabic" w:cs="Traditional Arabic"/>
+          <w:b/>
+          <w:bCs/>
+          <w:sz w:val="28"/>
+          <w:szCs w:val="28"/>
+        </w:rPr>
+        <w:t>Eventos</w:t>
+      </w:r>
+      <w:r>
+        <w:rPr>
+          <w:rFonts w:ascii="Traditional Arabic" w:hAnsi="Traditional Arabic" w:cs="Traditional Arabic"/>
+          <w:sz w:val="28"/>
+          <w:szCs w:val="28"/>
+        </w:rPr>
+        <w:t>…………………………………5</w:t>
+      </w:r>
+    </w:p>
+    <w:p>
+      <w:pPr>
+        <w:ind w:left="708" w:firstLine="708"/>
+        <w:rPr>
+          <w:rFonts w:ascii="Traditional Arabic" w:hAnsi="Traditional Arabic" w:cs="Traditional Arabic"/>
+          <w:sz w:val="28"/>
+          <w:szCs w:val="28"/>
+        </w:rPr>
+      </w:pPr>
+      <w:r>
+        <w:rPr>
+          <w:rFonts w:ascii="Traditional Arabic" w:hAnsi="Traditional Arabic" w:cs="Traditional Arabic"/>
+          <w:b/>
+          <w:bCs/>
+          <w:sz w:val="28"/>
+          <w:szCs w:val="28"/>
+        </w:rPr>
+        <w:t>Comandos</w:t>
+      </w:r>
+      <w:r>
+        <w:rPr>
+          <w:rFonts w:ascii="Traditional Arabic" w:hAnsi="Traditional Arabic" w:cs="Traditional Arabic"/>
+          <w:sz w:val="28"/>
+          <w:szCs w:val="28"/>
+        </w:rPr>
+        <w:t>……………………………</w:t>
+      </w:r>
+      <w:r>
+        <w:rPr>
+          <w:rFonts w:ascii="Traditional Arabic" w:hAnsi="Traditional Arabic" w:cs="Traditional Arabic"/>
+          <w:sz w:val="28"/>
+          <w:szCs w:val="28"/>
+        </w:rPr>
+        <w:t>...</w:t>
+      </w:r>
+      <w:r>
+        <w:rPr>
+          <w:rFonts w:ascii="Traditional Arabic" w:hAnsi="Traditional Arabic" w:cs="Traditional Arabic"/>
+          <w:sz w:val="28"/>
+          <w:szCs w:val="28"/>
+        </w:rPr>
+        <w:t>5</w:t>
+      </w:r>
+    </w:p>
+    <w:p>
+      <w:pPr>
+        <w:ind w:firstLine="708"/>
+        <w:rPr>
+          <w:rFonts w:ascii="Traditional Arabic" w:hAnsi="Traditional Arabic" w:cs="Traditional Arabic"/>
+          <w:sz w:val="28"/>
+          <w:szCs w:val="28"/>
+        </w:rPr>
+      </w:pPr>
+      <w:r>
+        <w:rPr>
+          <w:rFonts w:ascii="Traditional Arabic" w:hAnsi="Traditional Arabic" w:cs="Traditional Arabic"/>
+          <w:b/>
+          <w:bCs/>
+          <w:sz w:val="32"/>
+          <w:szCs w:val="32"/>
+        </w:rPr>
+        <w:t>Log</w:t>
+      </w:r>
+      <w:r>
+        <w:rPr>
+          <w:rFonts w:ascii="Traditional Arabic" w:hAnsi="Traditional Arabic" w:cs="Traditional Arabic"/>
+          <w:sz w:val="28"/>
+          <w:szCs w:val="28"/>
+        </w:rPr>
+        <w:t>…….</w:t>
+      </w:r>
+      <w:r>
+        <w:rPr>
+          <w:rFonts w:ascii="Traditional Arabic" w:hAnsi="Traditional Arabic" w:cs="Traditional Arabic"/>
+          <w:b/>
+          <w:bCs/>
+          <w:sz w:val="32"/>
+          <w:szCs w:val="32"/>
+        </w:rPr>
+        <w:t>.</w:t>
+      </w:r>
+      <w:r>
+        <w:rPr>
+          <w:rFonts w:ascii="Traditional Arabic" w:hAnsi="Traditional Arabic" w:cs="Traditional Arabic"/>
+          <w:sz w:val="28"/>
+          <w:szCs w:val="28"/>
+        </w:rPr>
+        <w:t>……………………………………</w:t>
+      </w:r>
+      <w:r>
+        <w:rPr>
+          <w:rFonts w:ascii="Traditional Arabic" w:hAnsi="Traditional Arabic" w:cs="Traditional Arabic"/>
+          <w:sz w:val="28"/>
+          <w:szCs w:val="28"/>
+        </w:rPr>
+        <w:t>…</w:t>
+      </w:r>
+      <w:r>
+        <w:rPr>
+          <w:rFonts w:ascii="Traditional Arabic" w:hAnsi="Traditional Arabic" w:cs="Traditional Arabic"/>
+          <w:sz w:val="28"/>
+          <w:szCs w:val="28"/>
+        </w:rPr>
+        <w:t>………...</w:t>
+      </w:r>
+      <w:r>
+        <w:rPr>
+          <w:rFonts w:ascii="Traditional Arabic" w:hAnsi="Traditional Arabic" w:cs="Traditional Arabic"/>
+          <w:sz w:val="28"/>
+          <w:szCs w:val="28"/>
+        </w:rPr>
+        <w:t>6</w:t>
+      </w:r>
+    </w:p>
+    <w:p>
+      <w:pPr>
+        <w:ind w:firstLine="708"/>
+        <w:rPr>
+          <w:rFonts w:ascii="Traditional Arabic" w:hAnsi="Traditional Arabic" w:cs="Traditional Arabic"/>
+          <w:sz w:val="28"/>
+          <w:szCs w:val="28"/>
+        </w:rPr>
+      </w:pPr>
+      <w:r>
+        <w:rPr>
+          <w:rFonts w:ascii="Traditional Arabic" w:hAnsi="Traditional Arabic" w:cs="Traditional Arabic"/>
+          <w:b/>
+          <w:bCs/>
+          <w:sz w:val="32"/>
+          <w:szCs w:val="32"/>
+        </w:rPr>
+        <w:t>Estadísticas</w:t>
+      </w:r>
+      <w:r>
+        <w:rPr>
+          <w:rFonts w:ascii="Traditional Arabic" w:hAnsi="Traditional Arabic" w:cs="Traditional Arabic"/>
+          <w:b/>
+          <w:bCs/>
+          <w:sz w:val="32"/>
+          <w:szCs w:val="32"/>
+        </w:rPr>
+        <w:t>.</w:t>
+      </w:r>
+      <w:r>
+        <w:rPr>
+          <w:rFonts w:ascii="Traditional Arabic" w:hAnsi="Traditional Arabic" w:cs="Traditional Arabic"/>
+          <w:sz w:val="28"/>
+          <w:szCs w:val="28"/>
+        </w:rPr>
+        <w:t>……………………………………</w:t>
+      </w:r>
+      <w:r>
+        <w:rPr>
+          <w:rFonts w:ascii="Traditional Arabic" w:hAnsi="Traditional Arabic" w:cs="Traditional Arabic"/>
+          <w:sz w:val="28"/>
+          <w:szCs w:val="28"/>
+        </w:rPr>
+        <w:t>…</w:t>
+      </w:r>
+      <w:r>
+        <w:rPr>
+          <w:rFonts w:ascii="Traditional Arabic" w:hAnsi="Traditional Arabic" w:cs="Traditional Arabic"/>
+          <w:sz w:val="28"/>
+          <w:szCs w:val="28"/>
+        </w:rPr>
+        <w:t>…….</w:t>
+      </w:r>
+      <w:r>
+        <w:rPr>
+          <w:rFonts w:ascii="Traditional Arabic" w:hAnsi="Traditional Arabic" w:cs="Traditional Arabic"/>
+          <w:sz w:val="28"/>
+          <w:szCs w:val="28"/>
+        </w:rPr>
+        <w:t>6</w:t>
+      </w:r>
+    </w:p>
+    <w:p>
+      <w:pPr>
+        <w:ind w:firstLine="708"/>
+        <w:rPr>
+          <w:rFonts w:ascii="Traditional Arabic" w:hAnsi="Traditional Arabic" w:cs="Traditional Arabic"/>
+          <w:sz w:val="28"/>
+          <w:szCs w:val="28"/>
+        </w:rPr>
+      </w:pPr>
+      <w:r>
+        <w:rPr>
+          <w:rFonts w:ascii="Traditional Arabic" w:hAnsi="Traditional Arabic" w:cs="Traditional Arabic"/>
+          <w:b/>
+          <w:bCs/>
+          <w:sz w:val="32"/>
+          <w:szCs w:val="32"/>
+        </w:rPr>
+        <w:t>Item</w:t>
+      </w:r>
+      <w:r>
+        <w:rPr>
+          <w:rFonts w:ascii="Traditional Arabic" w:hAnsi="Traditional Arabic" w:cs="Traditional Arabic"/>
+          <w:b/>
+          <w:bCs/>
+          <w:sz w:val="32"/>
+          <w:szCs w:val="32"/>
+        </w:rPr>
+        <w:t>.</w:t>
+      </w:r>
+      <w:r>
+        <w:rPr>
+          <w:rFonts w:ascii="Traditional Arabic" w:hAnsi="Traditional Arabic" w:cs="Traditional Arabic"/>
+          <w:sz w:val="28"/>
+          <w:szCs w:val="28"/>
+        </w:rPr>
+        <w:t>……………………</w:t>
+      </w:r>
+      <w:r>
+        <w:rPr>
+          <w:rFonts w:ascii="Traditional Arabic" w:hAnsi="Traditional Arabic" w:cs="Traditional Arabic"/>
+          <w:sz w:val="28"/>
+          <w:szCs w:val="28"/>
+        </w:rPr>
+        <w:t>……….</w:t>
+      </w:r>
+      <w:r>
+        <w:rPr>
+          <w:rFonts w:ascii="Traditional Arabic" w:hAnsi="Traditional Arabic" w:cs="Traditional Arabic"/>
+          <w:sz w:val="28"/>
+          <w:szCs w:val="28"/>
+        </w:rPr>
+        <w:t>………………</w:t>
+      </w:r>
+      <w:r>
+        <w:rPr>
+          <w:rFonts w:ascii="Traditional Arabic" w:hAnsi="Traditional Arabic" w:cs="Traditional Arabic"/>
+          <w:sz w:val="28"/>
+          <w:szCs w:val="28"/>
+        </w:rPr>
+        <w:t>…</w:t>
+      </w:r>
+      <w:r>
+        <w:rPr>
+          <w:rFonts w:ascii="Traditional Arabic" w:hAnsi="Traditional Arabic" w:cs="Traditional Arabic"/>
+          <w:sz w:val="28"/>
+          <w:szCs w:val="28"/>
+        </w:rPr>
+        <w:t>…….</w:t>
+      </w:r>
+      <w:r>
+        <w:rPr>
+          <w:rFonts w:ascii="Traditional Arabic" w:hAnsi="Traditional Arabic" w:cs="Traditional Arabic"/>
+          <w:sz w:val="28"/>
+          <w:szCs w:val="28"/>
+        </w:rPr>
+        <w:t>7</w:t>
+      </w:r>
+    </w:p>
+    <w:p>
+      <w:pPr>
+        <w:ind w:firstLine="708"/>
+        <w:rPr>
+          <w:rFonts w:ascii="Traditional Arabic" w:hAnsi="Traditional Arabic" w:cs="Traditional Arabic"/>
+          <w:sz w:val="28"/>
+          <w:szCs w:val="28"/>
+        </w:rPr>
+      </w:pPr>
+    </w:p>
+    <w:p>
+      <w:pPr>
+        <w:ind w:firstLine="708"/>
+        <w:rPr>
+          <w:rFonts w:ascii="Traditional Arabic" w:hAnsi="Traditional Arabic" w:cs="Traditional Arabic" w:hint="cs"/>
+          <w:b/>
+          <w:bCs/>
+          <w:sz w:val="32"/>
+          <w:szCs w:val="32"/>
           <w:u w:val="single"/>
         </w:rPr>
       </w:pPr>
       <w:r>
         <w:rPr>
-          <w:sz w:val="28"/>
-          <w:szCs w:val="28"/>
-        </w:rPr>
-        <w:br w:type="page"/>
-      </w:r>
-      <w:r>
-        <w:rPr>
-          <w:sz w:val="28"/>
-          <w:szCs w:val="28"/>
-        </w:rPr>
-        <w:lastRenderedPageBreak/>
+          <w:rFonts w:ascii="Traditional Arabic" w:hAnsi="Traditional Arabic" w:cs="Traditional Arabic" w:hint="cs"/>
+          <w:b/>
+          <w:bCs/>
+          <w:sz w:val="32"/>
+          <w:szCs w:val="32"/>
+        </w:rPr>
         <w:br w:type="page"/>
       </w:r>
     </w:p>
@@ -1657,21 +2173,373 @@
         <w:jc w:val="both"/>
         <w:rPr>
           <w:rFonts w:ascii="Traditional Arabic" w:hAnsi="Traditional Arabic" w:cs="Traditional Arabic"/>
+          <w:b/>
+          <w:bCs/>
+          <w:sz w:val="36"/>
+          <w:szCs w:val="36"/>
+        </w:rPr>
+      </w:pPr>
+      <w:r>
+        <w:rPr>
+          <w:rFonts w:ascii="Traditional Arabic" w:hAnsi="Traditional Arabic" w:cs="Traditional Arabic"/>
+          <w:b/>
+          <w:bCs/>
+          <w:sz w:val="36"/>
+          <w:szCs w:val="36"/>
+        </w:rPr>
+        <w:t>Estadísticas</w:t>
+      </w:r>
+    </w:p>
+    <w:p>
+      <w:pPr>
+        <w:jc w:val="both"/>
+        <w:rPr>
+          <w:rFonts w:ascii="Traditional Arabic" w:hAnsi="Traditional Arabic" w:cs="Traditional Arabic"/>
+          <w:sz w:val="28"/>
+          <w:szCs w:val="28"/>
+          <w:lang w:val="en-US"/>
+        </w:rPr>
+      </w:pPr>
+      <w:r>
+        <w:rPr>
+          <w:rFonts w:ascii="Traditional Arabic" w:hAnsi="Traditional Arabic" w:cs="Traditional Arabic"/>
+          <w:sz w:val="28"/>
+          <w:szCs w:val="28"/>
+        </w:rPr>
+        <w:t>Estadísticas es una clase creada a base de una necesidad de disminuir las responsabilidades de la clase Pokemon que estaba muy sobrecargada. Para lograr esto, Pokemon ahora tiene dentro una clase dedicada a manejar y almacenar todas aquellas estadísticas que afectan de una u otra forma a la jugada del usuario. Con esto se logra que Pokemon no tenga una doble dependencia con Habilidad o Estado, ya que estas dos pueden utilizar este objeto directamente.</w:t>
+      </w:r>
+    </w:p>
+    <w:p>
+      <w:pPr>
+        <w:jc w:val="both"/>
+        <w:rPr>
+          <w:rFonts w:ascii="Traditional Arabic" w:hAnsi="Traditional Arabic" w:cs="Traditional Arabic"/>
+          <w:sz w:val="28"/>
+          <w:szCs w:val="28"/>
+          <w:lang w:val="en-US"/>
+        </w:rPr>
+      </w:pPr>
+      <w:r>
+        <w:rPr>
+          <w:noProof/>
+        </w:rPr>
+        <w:lastRenderedPageBreak/>
+        <w:drawing>
+          <wp:inline distT="0" distB="0" distL="0" distR="0" wp14:anchorId="6585615E" wp14:editId="42DB77AF">
+            <wp:extent cx="5400040" cy="1507490"/>
+            <wp:effectExtent l="0" t="0" r="0" b="0"/>
+            <wp:docPr id="1657654908" name="Imagen 1"/>
+            <wp:cNvGraphicFramePr>
+              <a:graphicFrameLocks xmlns:a="http://schemas.openxmlformats.org/drawingml/2006/main" noChangeAspect="1"/>
+            </wp:cNvGraphicFramePr>
+            <a:graphic xmlns:a="http://schemas.openxmlformats.org/drawingml/2006/main">
+              <a:graphicData uri="http://schemas.openxmlformats.org/drawingml/2006/picture">
+                <pic:pic xmlns:pic="http://schemas.openxmlformats.org/drawingml/2006/picture">
+                  <pic:nvPicPr>
+                    <pic:cNvPr id="1657654908" name=""/>
+                    <pic:cNvPicPr/>
+                  </pic:nvPicPr>
+                  <pic:blipFill>
+                    <a:blip r:embed="rId13"/>
+                    <a:stretch>
+                      <a:fillRect/>
+                    </a:stretch>
+                  </pic:blipFill>
+                  <pic:spPr>
+                    <a:xfrm>
+                      <a:off x="0" y="0"/>
+                      <a:ext cx="5400040" cy="1507490"/>
+                    </a:xfrm>
+                    <a:prstGeom prst="rect">
+                      <a:avLst/>
+                    </a:prstGeom>
+                  </pic:spPr>
+                </pic:pic>
+              </a:graphicData>
+            </a:graphic>
+          </wp:inline>
+        </w:drawing>
+      </w:r>
+    </w:p>
+    <w:p>
+      <w:pPr>
+        <w:jc w:val="both"/>
+        <w:rPr>
+          <w:rFonts w:ascii="Traditional Arabic" w:hAnsi="Traditional Arabic" w:cs="Traditional Arabic"/>
+          <w:sz w:val="28"/>
+          <w:szCs w:val="28"/>
+        </w:rPr>
+      </w:pPr>
+      <w:r>
+        <w:rPr>
+          <w:rFonts w:ascii="Traditional Arabic" w:hAnsi="Traditional Arabic" w:cs="Traditional Arabic"/>
+          <w:sz w:val="28"/>
+          <w:szCs w:val="28"/>
+        </w:rPr>
+        <w:t>En el diagrama se ve u</w:t>
+      </w:r>
+      <w:r>
+        <w:rPr>
+          <w:rFonts w:ascii="Traditional Arabic" w:hAnsi="Traditional Arabic" w:cs="Traditional Arabic"/>
+          <w:sz w:val="28"/>
+          <w:szCs w:val="28"/>
+        </w:rPr>
+        <w:t xml:space="preserve">n ejemplo de uso de Estadísticas con HabilidadModificacionEstadistica. ModEstadistica hace lo mismo que en la primera entrega, pero con mejoras en el código. La habilidad crea el comando correspondiente para realizar la modificación; esto </w:t>
+      </w:r>
+      <w:r>
+        <w:rPr>
+          <w:rFonts w:ascii="Traditional Arabic" w:hAnsi="Traditional Arabic" w:cs="Traditional Arabic"/>
+          <w:sz w:val="28"/>
+          <w:szCs w:val="28"/>
+        </w:rPr>
+        <w:t>lográndolo, pasándole</w:t>
+      </w:r>
+      <w:r>
+        <w:rPr>
+          <w:rFonts w:ascii="Traditional Arabic" w:hAnsi="Traditional Arabic" w:cs="Traditional Arabic"/>
+          <w:sz w:val="28"/>
+          <w:szCs w:val="28"/>
+        </w:rPr>
+        <w:t xml:space="preserve"> las estadísticas que recibe del mismo Pokemon que llamó la habilidad y</w:t>
+      </w:r>
+      <w:r>
+        <w:rPr>
+          <w:rFonts w:ascii="Traditional Arabic" w:hAnsi="Traditional Arabic" w:cs="Traditional Arabic"/>
+          <w:sz w:val="28"/>
+          <w:szCs w:val="28"/>
+        </w:rPr>
+        <w:t xml:space="preserve"> el ModEstadistica que se le fue asignado en su creación. El comando es el encargado de hacer que estos objetos interactúen. El Estado luego hace lo mismo (creando el comando que corresponda) para cambiar las Estadísticas si es necesario.</w:t>
+      </w:r>
+    </w:p>
+    <w:p>
+      <w:pPr>
+        <w:jc w:val="both"/>
+        <w:rPr>
+          <w:rFonts w:ascii="Traditional Arabic" w:hAnsi="Traditional Arabic" w:cs="Traditional Arabic"/>
+          <w:sz w:val="28"/>
+          <w:szCs w:val="28"/>
+        </w:rPr>
+      </w:pPr>
+    </w:p>
+    <w:p>
+      <w:pPr>
+        <w:jc w:val="both"/>
+        <w:rPr>
+          <w:rFonts w:ascii="Traditional Arabic" w:hAnsi="Traditional Arabic" w:cs="Traditional Arabic"/>
+          <w:b/>
+          <w:bCs/>
+          <w:sz w:val="36"/>
+          <w:szCs w:val="36"/>
+        </w:rPr>
+      </w:pPr>
+      <w:r>
+        <w:rPr>
+          <w:rFonts w:ascii="Traditional Arabic" w:hAnsi="Traditional Arabic" w:cs="Traditional Arabic"/>
+          <w:b/>
+          <w:bCs/>
+          <w:sz w:val="36"/>
+          <w:szCs w:val="36"/>
+        </w:rPr>
+        <w:t>Item</w:t>
+      </w:r>
+    </w:p>
+    <w:p>
+      <w:pPr>
+        <w:jc w:val="both"/>
+        <w:rPr>
+          <w:rFonts w:ascii="Traditional Arabic" w:hAnsi="Traditional Arabic" w:cs="Traditional Arabic"/>
+          <w:sz w:val="28"/>
+          <w:szCs w:val="28"/>
+          <w:lang w:val="en-US"/>
+        </w:rPr>
+      </w:pPr>
+      <w:r>
+        <w:rPr>
+          <w:rFonts w:ascii="Traditional Arabic" w:hAnsi="Traditional Arabic" w:cs="Traditional Arabic"/>
+          <w:sz w:val="28"/>
+          <w:szCs w:val="28"/>
+        </w:rPr>
+        <w:t xml:space="preserve">Item en su estructura sigue siendo lo mismo que en la </w:t>
+      </w:r>
+      <w:r>
+        <w:rPr>
+          <w:rFonts w:ascii="Traditional Arabic" w:hAnsi="Traditional Arabic" w:cs="Traditional Arabic"/>
+          <w:sz w:val="28"/>
+          <w:szCs w:val="28"/>
+        </w:rPr>
+        <w:t>primera entrega</w:t>
+      </w:r>
+      <w:r>
+        <w:rPr>
+          <w:rFonts w:ascii="Traditional Arabic" w:hAnsi="Traditional Arabic" w:cs="Traditional Arabic"/>
+          <w:sz w:val="28"/>
+          <w:szCs w:val="28"/>
+        </w:rPr>
+        <w:t xml:space="preserve">, pero en cuanto a como se utiliza, como actúa y su comportamiento, todo fue alterado. En primer lugar, la clase Item ya no viaja por el Pokemon y el Estado para poder utilizarse. En su lugar, </w:t>
+      </w:r>
+      <w:r>
+        <w:rPr>
+          <w:rFonts w:ascii="Traditional Arabic" w:hAnsi="Traditional Arabic" w:cs="Traditional Arabic"/>
+          <w:sz w:val="28"/>
+          <w:szCs w:val="28"/>
+        </w:rPr>
+        <w:t>los ítems van a crear un comando que puede ser de modificación de estadística o de modificación de estado. Estos comandos usan las estadísticas/estado del pokemon, y para el caso de las estadísticas es tan solo un uso preconfigurado del comando de modificación de estadística.</w:t>
+      </w:r>
+    </w:p>
+    <w:p>
+      <w:pPr>
+        <w:jc w:val="both"/>
+        <w:rPr>
+          <w:rFonts w:ascii="Traditional Arabic" w:hAnsi="Traditional Arabic" w:cs="Traditional Arabic"/>
+          <w:sz w:val="28"/>
+          <w:szCs w:val="28"/>
+          <w:lang w:val="en-US"/>
+        </w:rPr>
+      </w:pPr>
+      <w:r>
+        <w:rPr>
+          <w:noProof/>
+        </w:rPr>
+        <w:drawing>
+          <wp:inline distT="0" distB="0" distL="0" distR="0" wp14:anchorId="2EFC465E" wp14:editId="5F61EAE2">
+            <wp:extent cx="5400040" cy="1354455"/>
+            <wp:effectExtent l="0" t="0" r="0" b="0"/>
+            <wp:docPr id="2129442207" name="Imagen 1"/>
+            <wp:cNvGraphicFramePr>
+              <a:graphicFrameLocks xmlns:a="http://schemas.openxmlformats.org/drawingml/2006/main" noChangeAspect="1"/>
+            </wp:cNvGraphicFramePr>
+            <a:graphic xmlns:a="http://schemas.openxmlformats.org/drawingml/2006/main">
+              <a:graphicData uri="http://schemas.openxmlformats.org/drawingml/2006/picture">
+                <pic:pic xmlns:pic="http://schemas.openxmlformats.org/drawingml/2006/picture">
+                  <pic:nvPicPr>
+                    <pic:cNvPr id="2129442207" name=""/>
+                    <pic:cNvPicPr/>
+                  </pic:nvPicPr>
+                  <pic:blipFill>
+                    <a:blip r:embed="rId14"/>
+                    <a:stretch>
+                      <a:fillRect/>
+                    </a:stretch>
+                  </pic:blipFill>
+                  <pic:spPr>
+                    <a:xfrm>
+                      <a:off x="0" y="0"/>
+                      <a:ext cx="5400040" cy="1354455"/>
+                    </a:xfrm>
+                    <a:prstGeom prst="rect">
+                      <a:avLst/>
+                    </a:prstGeom>
+                  </pic:spPr>
+                </pic:pic>
+              </a:graphicData>
+            </a:graphic>
+          </wp:inline>
+        </w:drawing>
+      </w:r>
+    </w:p>
+    <w:p>
+      <w:pPr>
+        <w:jc w:val="both"/>
+        <w:rPr>
+          <w:rFonts w:ascii="Traditional Arabic" w:hAnsi="Traditional Arabic" w:cs="Traditional Arabic"/>
+          <w:sz w:val="28"/>
+          <w:szCs w:val="28"/>
+        </w:rPr>
+      </w:pPr>
+      <w:r>
+        <w:rPr>
+          <w:rFonts w:ascii="Traditional Arabic" w:hAnsi="Traditional Arabic" w:cs="Traditional Arabic"/>
+          <w:sz w:val="28"/>
+          <w:szCs w:val="28"/>
+        </w:rPr>
+        <w:lastRenderedPageBreak/>
+        <w:t>En el diagrama se p</w:t>
+      </w:r>
+      <w:r>
+        <w:rPr>
+          <w:rFonts w:ascii="Traditional Arabic" w:hAnsi="Traditional Arabic" w:cs="Traditional Arabic"/>
+          <w:sz w:val="28"/>
+          <w:szCs w:val="28"/>
+        </w:rPr>
+        <w:t xml:space="preserve">uede ver que la clase Estado tiene funciones que siguen el patrón de </w:t>
+      </w:r>
+      <w:r>
+        <w:rPr>
+          <w:rFonts w:ascii="Traditional Arabic" w:hAnsi="Traditional Arabic" w:cs="Traditional Arabic"/>
+          <w:i/>
+          <w:iCs/>
+          <w:sz w:val="28"/>
+          <w:szCs w:val="28"/>
+        </w:rPr>
+        <w:t>V</w:t>
+      </w:r>
+      <w:r>
+        <w:rPr>
+          <w:rFonts w:ascii="Traditional Arabic" w:hAnsi="Traditional Arabic" w:cs="Traditional Arabic"/>
+          <w:i/>
+          <w:iCs/>
+          <w:sz w:val="28"/>
+          <w:szCs w:val="28"/>
+        </w:rPr>
+        <w:t>isitor</w:t>
+      </w:r>
+      <w:r>
+        <w:rPr>
+          <w:rFonts w:ascii="Traditional Arabic" w:hAnsi="Traditional Arabic" w:cs="Traditional Arabic"/>
+          <w:i/>
+          <w:iCs/>
+          <w:sz w:val="28"/>
+          <w:szCs w:val="28"/>
+        </w:rPr>
+        <w:t xml:space="preserve">. </w:t>
+      </w:r>
+      <w:r>
+        <w:rPr>
+          <w:rFonts w:ascii="Traditional Arabic" w:hAnsi="Traditional Arabic" w:cs="Traditional Arabic"/>
+          <w:sz w:val="28"/>
+          <w:szCs w:val="28"/>
+        </w:rPr>
+        <w:t xml:space="preserve">Los ítems mandan un estado del tipo que suelen curar y, a través del patrón de Visitor y con herencia, la clase de un estado particular entiende el mensaje que se refiere a la suya para curarse. Estos comandos son los que luego se cargan en la clase </w:t>
+      </w:r>
+      <w:r>
+        <w:rPr>
+          <w:rFonts w:ascii="Traditional Arabic" w:hAnsi="Traditional Arabic" w:cs="Traditional Arabic"/>
+          <w:i/>
+          <w:iCs/>
+          <w:sz w:val="28"/>
+          <w:szCs w:val="28"/>
+        </w:rPr>
+        <w:t>Eventos.</w:t>
+      </w:r>
+    </w:p>
+    <w:p>
+      <w:pPr>
+        <w:jc w:val="both"/>
+        <w:rPr>
+          <w:rFonts w:ascii="Traditional Arabic" w:hAnsi="Traditional Arabic" w:cs="Traditional Arabic"/>
+          <w:b/>
+          <w:bCs/>
+          <w:sz w:val="36"/>
+          <w:szCs w:val="36"/>
+        </w:rPr>
+      </w:pPr>
+    </w:p>
+    <w:p>
+      <w:pPr>
+        <w:jc w:val="both"/>
+        <w:rPr>
+          <w:rFonts w:ascii="Traditional Arabic" w:hAnsi="Traditional Arabic" w:cs="Traditional Arabic"/>
           <w:sz w:val="28"/>
           <w:szCs w:val="28"/>
         </w:rPr>
       </w:pPr>
     </w:p>
     <w:sectPr>
-      <w:headerReference w:type="even" r:id="rId13"/>
-      <w:headerReference w:type="default" r:id="rId14"/>
-      <w:footerReference w:type="even" r:id="rId15"/>
-      <w:footerReference w:type="default" r:id="rId16"/>
-      <w:headerReference w:type="first" r:id="rId17"/>
-      <w:footerReference w:type="first" r:id="rId18"/>
+      <w:footerReference w:type="default" r:id="rId15"/>
       <w:pgSz w:w="11906" w:h="16838"/>
       <w:pgMar w:top="1417" w:right="1701" w:bottom="1417" w:left="1701" w:header="708" w:footer="708" w:gutter="0"/>
       <w:cols w:space="708"/>
+      <w:titlePg/>
       <w:docGrid w:linePitch="360"/>
     </w:sectPr>
   </w:body>
@@ -1705,26 +2573,211 @@
 
 <file path=word/footer1.xml><?xml version="1.0" encoding="utf-8"?>
 <w:ftr xmlns:wpc="http://schemas.microsoft.com/office/word/2010/wordprocessingCanvas" xmlns:cx="http://schemas.microsoft.com/office/drawing/2014/chartex" xmlns:cx1="http://schemas.microsoft.com/office/drawing/2015/9/8/chartex" xmlns:cx2="http://schemas.microsoft.com/office/drawing/2015/10/21/chartex" xmlns:cx3="http://schemas.microsoft.com/office/drawing/2016/5/9/chartex" xmlns:cx4="http://schemas.microsoft.com/office/drawing/2016/5/10/chartex" xmlns:cx5="http://schemas.microsoft.com/office/drawing/2016/5/11/chartex" xmlns:cx6="http://schemas.microsoft.com/office/drawing/2016/5/12/chartex" xmlns:cx7="http://schemas.microsoft.com/office/drawing/2016/5/13/chartex" xmlns:cx8="http://schemas.microsoft.com/office/drawing/2016/5/14/chartex" xmlns:mc="http://schemas.openxmlformats.org/markup-compatibility/2006" xmlns:aink="http://schemas.microsoft.com/office/drawing/2016/ink" xmlns:am3d="http://schemas.microsoft.com/office/drawing/2017/model3d" xmlns:o="urn:schemas-microsoft-com:office:office" xmlns:oel="http://schemas.microsoft.com/office/2019/extlst" xmlns:r="http://schemas.openxmlformats.org/officeDocument/2006/relationships" xmlns:m="http://schemas.openxmlformats.org/officeDocument/2006/math" xmlns:v="urn:schemas-microsoft-com:vml" xmlns:wp14="http://schemas.microsoft.com/office/word/2010/wordprocessingDrawing" xmlns:wp="http://schemas.openxmlformats.org/drawingml/2006/wordprocessingDrawing" xmlns:w10="urn:schemas-microsoft-com:office:word" xmlns:w="http://schemas.openxmlformats.org/wordprocessingml/2006/main" xmlns:w14="http://schemas.microsoft.com/office/word/2010/wordml" xmlns:w15="http://schemas.microsoft.com/office/word/2012/wordml" xmlns:w16cex="http://schemas.microsoft.com/office/word/2018/wordml/cex" xmlns:w16cid="http://schemas.microsoft.com/office/word/2016/wordml/cid" xmlns:w16="http://schemas.microsoft.com/office/word/2018/wordml" xmlns:w16sdtdh="http://schemas.microsoft.com/office/word/2020/wordml/sdtdatahash" xmlns:w16se="http://schemas.microsoft.com/office/word/2015/wordml/symex" xmlns:wpg="http://schemas.microsoft.com/office/word/2010/wordprocessingGroup" xmlns:wpi="http://schemas.microsoft.com/office/word/2010/wordprocessingInk" xmlns:wne="http://schemas.microsoft.com/office/word/2006/wordml" xmlns:wps="http://schemas.microsoft.com/office/word/2010/wordprocessingShape" mc:Ignorable="w14 w15 w16se w16cid w16 w16cex w16sdtdh wp14">
-  <w:p>
-    <w:pPr>
-      <w:pStyle w:val="Piedepgina"/>
-    </w:pPr>
-  </w:p>
-</w:ftr>
-</file>
-
-<file path=word/footer2.xml><?xml version="1.0" encoding="utf-8"?>
-<w:ftr xmlns:wpc="http://schemas.microsoft.com/office/word/2010/wordprocessingCanvas" xmlns:cx="http://schemas.microsoft.com/office/drawing/2014/chartex" xmlns:cx1="http://schemas.microsoft.com/office/drawing/2015/9/8/chartex" xmlns:cx2="http://schemas.microsoft.com/office/drawing/2015/10/21/chartex" xmlns:cx3="http://schemas.microsoft.com/office/drawing/2016/5/9/chartex" xmlns:cx4="http://schemas.microsoft.com/office/drawing/2016/5/10/chartex" xmlns:cx5="http://schemas.microsoft.com/office/drawing/2016/5/11/chartex" xmlns:cx6="http://schemas.microsoft.com/office/drawing/2016/5/12/chartex" xmlns:cx7="http://schemas.microsoft.com/office/drawing/2016/5/13/chartex" xmlns:cx8="http://schemas.microsoft.com/office/drawing/2016/5/14/chartex" xmlns:mc="http://schemas.openxmlformats.org/markup-compatibility/2006" xmlns:aink="http://schemas.microsoft.com/office/drawing/2016/ink" xmlns:am3d="http://schemas.microsoft.com/office/drawing/2017/model3d" xmlns:o="urn:schemas-microsoft-com:office:office" xmlns:oel="http://schemas.microsoft.com/office/2019/extlst" xmlns:r="http://schemas.openxmlformats.org/officeDocument/2006/relationships" xmlns:m="http://schemas.openxmlformats.org/officeDocument/2006/math" xmlns:v="urn:schemas-microsoft-com:vml" xmlns:wp14="http://schemas.microsoft.com/office/word/2010/wordprocessingDrawing" xmlns:wp="http://schemas.openxmlformats.org/drawingml/2006/wordprocessingDrawing" xmlns:w10="urn:schemas-microsoft-com:office:word" xmlns:w="http://schemas.openxmlformats.org/wordprocessingml/2006/main" xmlns:w14="http://schemas.microsoft.com/office/word/2010/wordml" xmlns:w15="http://schemas.microsoft.com/office/word/2012/wordml" xmlns:w16cex="http://schemas.microsoft.com/office/word/2018/wordml/cex" xmlns:w16cid="http://schemas.microsoft.com/office/word/2016/wordml/cid" xmlns:w16="http://schemas.microsoft.com/office/word/2018/wordml" xmlns:w16sdtdh="http://schemas.microsoft.com/office/word/2020/wordml/sdtdatahash" xmlns:w16se="http://schemas.microsoft.com/office/word/2015/wordml/symex" xmlns:wpg="http://schemas.microsoft.com/office/word/2010/wordprocessingGroup" xmlns:wpi="http://schemas.microsoft.com/office/word/2010/wordprocessingInk" xmlns:wne="http://schemas.microsoft.com/office/word/2006/wordml" xmlns:wps="http://schemas.microsoft.com/office/word/2010/wordprocessingShape" mc:Ignorable="w14 w15 w16se w16cid w16 w16cex w16sdtdh wp14">
-  <w:p>
-    <w:pPr>
-      <w:pStyle w:val="Piedepgina"/>
-    </w:pPr>
-  </w:p>
-</w:ftr>
-</file>
-
-<file path=word/footer3.xml><?xml version="1.0" encoding="utf-8"?>
-<w:ftr xmlns:wpc="http://schemas.microsoft.com/office/word/2010/wordprocessingCanvas" xmlns:cx="http://schemas.microsoft.com/office/drawing/2014/chartex" xmlns:cx1="http://schemas.microsoft.com/office/drawing/2015/9/8/chartex" xmlns:cx2="http://schemas.microsoft.com/office/drawing/2015/10/21/chartex" xmlns:cx3="http://schemas.microsoft.com/office/drawing/2016/5/9/chartex" xmlns:cx4="http://schemas.microsoft.com/office/drawing/2016/5/10/chartex" xmlns:cx5="http://schemas.microsoft.com/office/drawing/2016/5/11/chartex" xmlns:cx6="http://schemas.microsoft.com/office/drawing/2016/5/12/chartex" xmlns:cx7="http://schemas.microsoft.com/office/drawing/2016/5/13/chartex" xmlns:cx8="http://schemas.microsoft.com/office/drawing/2016/5/14/chartex" xmlns:mc="http://schemas.openxmlformats.org/markup-compatibility/2006" xmlns:aink="http://schemas.microsoft.com/office/drawing/2016/ink" xmlns:am3d="http://schemas.microsoft.com/office/drawing/2017/model3d" xmlns:o="urn:schemas-microsoft-com:office:office" xmlns:oel="http://schemas.microsoft.com/office/2019/extlst" xmlns:r="http://schemas.openxmlformats.org/officeDocument/2006/relationships" xmlns:m="http://schemas.openxmlformats.org/officeDocument/2006/math" xmlns:v="urn:schemas-microsoft-com:vml" xmlns:wp14="http://schemas.microsoft.com/office/word/2010/wordprocessingDrawing" xmlns:wp="http://schemas.openxmlformats.org/drawingml/2006/wordprocessingDrawing" xmlns:w10="urn:schemas-microsoft-com:office:word" xmlns:w="http://schemas.openxmlformats.org/wordprocessingml/2006/main" xmlns:w14="http://schemas.microsoft.com/office/word/2010/wordml" xmlns:w15="http://schemas.microsoft.com/office/word/2012/wordml" xmlns:w16cex="http://schemas.microsoft.com/office/word/2018/wordml/cex" xmlns:w16cid="http://schemas.microsoft.com/office/word/2016/wordml/cid" xmlns:w16="http://schemas.microsoft.com/office/word/2018/wordml" xmlns:w16sdtdh="http://schemas.microsoft.com/office/word/2020/wordml/sdtdatahash" xmlns:w16se="http://schemas.microsoft.com/office/word/2015/wordml/symex" xmlns:wpg="http://schemas.microsoft.com/office/word/2010/wordprocessingGroup" xmlns:wpi="http://schemas.microsoft.com/office/word/2010/wordprocessingInk" xmlns:wne="http://schemas.microsoft.com/office/word/2006/wordml" xmlns:wps="http://schemas.microsoft.com/office/word/2010/wordprocessingShape" mc:Ignorable="w14 w15 w16se w16cid w16 w16cex w16sdtdh wp14">
+  <w:sdt>
+    <w:sdtPr>
+      <w:rPr>
+        <w:rFonts w:asciiTheme="majorHAnsi" w:eastAsiaTheme="majorEastAsia" w:hAnsiTheme="majorHAnsi" w:cstheme="majorBidi"/>
+      </w:rPr>
+      <w:id w:val="1619718163"/>
+      <w:docPartObj>
+        <w:docPartGallery w:val="Page Numbers (Bottom of Page)"/>
+        <w:docPartUnique/>
+      </w:docPartObj>
+    </w:sdtPr>
+    <w:sdtContent>
+      <w:sdt>
+        <w:sdtPr>
+          <w:rPr>
+            <w:rFonts w:asciiTheme="majorHAnsi" w:eastAsiaTheme="majorEastAsia" w:hAnsiTheme="majorHAnsi" w:cstheme="majorBidi"/>
+          </w:rPr>
+          <w:id w:val="1806425445"/>
+        </w:sdtPr>
+        <w:sdtContent>
+          <w:p>
+            <w:pPr>
+              <w:rPr>
+                <w:rFonts w:asciiTheme="majorHAnsi" w:eastAsiaTheme="majorEastAsia" w:hAnsiTheme="majorHAnsi" w:cstheme="majorBidi"/>
+              </w:rPr>
+            </w:pPr>
+            <w:r>
+              <w:rPr>
+                <w:rFonts w:asciiTheme="majorHAnsi" w:eastAsiaTheme="majorEastAsia" w:hAnsiTheme="majorHAnsi" w:cstheme="majorBidi"/>
+                <w:noProof/>
+              </w:rPr>
+              <mc:AlternateContent>
+                <mc:Choice Requires="wps">
+                  <w:drawing>
+                    <wp:anchor distT="0" distB="0" distL="114300" distR="114300" simplePos="0" relativeHeight="251659264" behindDoc="0" locked="0" layoutInCell="1" allowOverlap="1" wp14:anchorId="48AF3AD6" wp14:editId="324E1615">
+                      <wp:simplePos x="0" y="0"/>
+                      <wp:positionH relativeFrom="margin">
+                        <wp:align>center</wp:align>
+                      </wp:positionH>
+                      <wp:positionV relativeFrom="bottomMargin">
+                        <wp:align>center</wp:align>
+                      </wp:positionV>
+                      <wp:extent cx="626745" cy="626745"/>
+                      <wp:effectExtent l="0" t="0" r="1905" b="1905"/>
+                      <wp:wrapNone/>
+                      <wp:docPr id="1317742543" name="Elipse 1"/>
+                      <wp:cNvGraphicFramePr>
+                        <a:graphicFrameLocks xmlns:a="http://schemas.openxmlformats.org/drawingml/2006/main"/>
+                      </wp:cNvGraphicFramePr>
+                      <a:graphic xmlns:a="http://schemas.openxmlformats.org/drawingml/2006/main">
+                        <a:graphicData uri="http://schemas.microsoft.com/office/word/2010/wordprocessingShape">
+                          <wps:wsp>
+                            <wps:cNvSpPr>
+                              <a:spLocks noChangeArrowheads="1"/>
+                            </wps:cNvSpPr>
+                            <wps:spPr bwMode="auto">
+                              <a:xfrm>
+                                <a:off x="0" y="0"/>
+                                <a:ext cx="626745" cy="626745"/>
+                              </a:xfrm>
+                              <a:prstGeom prst="ellipse">
+                                <a:avLst/>
+                              </a:prstGeom>
+                              <a:solidFill>
+                                <a:srgbClr val="40618B"/>
+                              </a:solidFill>
+                              <a:ln>
+                                <a:noFill/>
+                              </a:ln>
+                              <a:extLst>
+                                <a:ext uri="{91240B29-F687-4F45-9708-019B960494DF}">
+                                  <a14:hiddenLine xmlns:a14="http://schemas.microsoft.com/office/drawing/2010/main" w="9525">
+                                    <a:solidFill>
+                                      <a:srgbClr val="000000"/>
+                                    </a:solidFill>
+                                    <a:round/>
+                                    <a:headEnd/>
+                                    <a:tailEnd/>
+                                  </a14:hiddenLine>
+                                </a:ext>
+                              </a:extLst>
+                            </wps:spPr>
+                            <wps:txbx>
+                              <w:txbxContent>
+                                <w:p>
+                                  <w:pPr>
+                                    <w:pStyle w:val="Piedepgina"/>
+                                    <w:jc w:val="center"/>
+                                    <w:rPr>
+                                      <w:b/>
+                                      <w:bCs/>
+                                      <w:color w:val="FFFFFF" w:themeColor="background1"/>
+                                      <w:sz w:val="32"/>
+                                      <w:szCs w:val="32"/>
+                                    </w:rPr>
+                                  </w:pPr>
+                                  <w:r>
+                                    <w:fldChar w:fldCharType="begin"/>
+                                  </w:r>
+                                  <w:r>
+                                    <w:instrText>PAGE    \* MERGEFORMAT</w:instrText>
+                                  </w:r>
+                                  <w:r>
+                                    <w:fldChar w:fldCharType="separate"/>
+                                  </w:r>
+                                  <w:r>
+                                    <w:rPr>
+                                      <w:b/>
+                                      <w:bCs/>
+                                      <w:color w:val="FFFFFF" w:themeColor="background1"/>
+                                      <w:sz w:val="32"/>
+                                      <w:szCs w:val="32"/>
+                                      <w:lang w:val="es-MX"/>
+                                    </w:rPr>
+                                    <w:t>2</w:t>
+                                  </w:r>
+                                  <w:r>
+                                    <w:rPr>
+                                      <w:b/>
+                                      <w:bCs/>
+                                      <w:color w:val="FFFFFF" w:themeColor="background1"/>
+                                      <w:sz w:val="32"/>
+                                      <w:szCs w:val="32"/>
+                                    </w:rPr>
+                                    <w:fldChar w:fldCharType="end"/>
+                                  </w:r>
+                                </w:p>
+                              </w:txbxContent>
+                            </wps:txbx>
+                            <wps:bodyPr rot="0" vert="horz" wrap="square" lIns="91440" tIns="45720" rIns="91440" bIns="45720" anchor="ctr" anchorCtr="0" upright="1">
+                              <a:noAutofit/>
+                            </wps:bodyPr>
+                          </wps:wsp>
+                        </a:graphicData>
+                      </a:graphic>
+                      <wp14:sizeRelH relativeFrom="page">
+                        <wp14:pctWidth>0</wp14:pctWidth>
+                      </wp14:sizeRelH>
+                      <wp14:sizeRelV relativeFrom="page">
+                        <wp14:pctHeight>0</wp14:pctHeight>
+                      </wp14:sizeRelV>
+                    </wp:anchor>
+                  </w:drawing>
+                </mc:Choice>
+                <mc:Fallback>
+                  <w:pict>
+                    <v:oval w14:anchorId="48AF3AD6" id="Elipse 1" o:spid="_x0000_s1028" style="position:absolute;margin-left:0;margin-top:0;width:49.35pt;height:49.35pt;z-index:251659264;visibility:visible;mso-wrap-style:square;mso-width-percent:0;mso-height-percent:0;mso-wrap-distance-left:9pt;mso-wrap-distance-top:0;mso-wrap-distance-right:9pt;mso-wrap-distance-bottom:0;mso-position-horizontal:center;mso-position-horizontal-relative:margin;mso-position-vertical:center;mso-position-vertical-relative:bottom-margin-area;mso-width-percent:0;mso-height-percent:0;mso-width-relative:page;mso-height-relative:page;v-text-anchor:middle" o:gfxdata="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" fillcolor="#40618b" stroked="f">
+                      <v:textbox>
+                        <w:txbxContent>
+                          <w:p>
+                            <w:pPr>
+                              <w:pStyle w:val="Piedepgina"/>
+                              <w:jc w:val="center"/>
+                              <w:rPr>
+                                <w:b/>
+                                <w:bCs/>
+                                <w:color w:val="FFFFFF" w:themeColor="background1"/>
+                                <w:sz w:val="32"/>
+                                <w:szCs w:val="32"/>
+                              </w:rPr>
+                            </w:pPr>
+                            <w:r>
+                              <w:fldChar w:fldCharType="begin"/>
+                            </w:r>
+                            <w:r>
+                              <w:instrText>PAGE    \* MERGEFORMAT</w:instrText>
+                            </w:r>
+                            <w:r>
+                              <w:fldChar w:fldCharType="separate"/>
+                            </w:r>
+                            <w:r>
+                              <w:rPr>
+                                <w:b/>
+                                <w:bCs/>
+                                <w:color w:val="FFFFFF" w:themeColor="background1"/>
+                                <w:sz w:val="32"/>
+                                <w:szCs w:val="32"/>
+                                <w:lang w:val="es-MX"/>
+                              </w:rPr>
+                              <w:t>2</w:t>
+                            </w:r>
+                            <w:r>
+                              <w:rPr>
+                                <w:b/>
+                                <w:bCs/>
+                                <w:color w:val="FFFFFF" w:themeColor="background1"/>
+                                <w:sz w:val="32"/>
+                                <w:szCs w:val="32"/>
+                              </w:rPr>
+                              <w:fldChar w:fldCharType="end"/>
+                            </w:r>
+                          </w:p>
+                        </w:txbxContent>
+                      </v:textbox>
+                      <w10:wrap anchorx="margin" anchory="margin"/>
+                    </v:oval>
+                  </w:pict>
+                </mc:Fallback>
+              </mc:AlternateContent>
+            </w:r>
+          </w:p>
+        </w:sdtContent>
+      </w:sdt>
+    </w:sdtContent>
+  </w:sdt>
   <w:p>
     <w:pPr>
       <w:pStyle w:val="Piedepgina"/>
@@ -1756,36 +2809,6 @@
     </w:p>
   </w:footnote>
 </w:footnotes>
-</file>
-
-<file path=word/header1.xml><?xml version="1.0" encoding="utf-8"?>
-<w:hdr xmlns:wpc="http://schemas.microsoft.com/office/word/2010/wordprocessingCanvas" xmlns:cx="http://schemas.microsoft.com/office/drawing/2014/chartex" xmlns:cx1="http://schemas.microsoft.com/office/drawing/2015/9/8/chartex" xmlns:cx2="http://schemas.microsoft.com/office/drawing/2015/10/21/chartex" xmlns:cx3="http://schemas.microsoft.com/office/drawing/2016/5/9/chartex" xmlns:cx4="http://schemas.microsoft.com/office/drawing/2016/5/10/chartex" xmlns:cx5="http://schemas.microsoft.com/office/drawing/2016/5/11/chartex" xmlns:cx6="http://schemas.microsoft.com/office/drawing/2016/5/12/chartex" xmlns:cx7="http://schemas.microsoft.com/office/drawing/2016/5/13/chartex" xmlns:cx8="http://schemas.microsoft.com/office/drawing/2016/5/14/chartex" xmlns:mc="http://schemas.openxmlformats.org/markup-compatibility/2006" xmlns:aink="http://schemas.microsoft.com/office/drawing/2016/ink" xmlns:am3d="http://schemas.microsoft.com/office/drawing/2017/model3d" xmlns:o="urn:schemas-microsoft-com:office:office" xmlns:oel="http://schemas.microsoft.com/office/2019/extlst" xmlns:r="http://schemas.openxmlformats.org/officeDocument/2006/relationships" xmlns:m="http://schemas.openxmlformats.org/officeDocument/2006/math" xmlns:v="urn:schemas-microsoft-com:vml" xmlns:wp14="http://schemas.microsoft.com/office/word/2010/wordprocessingDrawing" xmlns:wp="http://schemas.openxmlformats.org/drawingml/2006/wordprocessingDrawing" xmlns:w10="urn:schemas-microsoft-com:office:word" xmlns:w="http://schemas.openxmlformats.org/wordprocessingml/2006/main" xmlns:w14="http://schemas.microsoft.com/office/word/2010/wordml" xmlns:w15="http://schemas.microsoft.com/office/word/2012/wordml" xmlns:w16cex="http://schemas.microsoft.com/office/word/2018/wordml/cex" xmlns:w16cid="http://schemas.microsoft.com/office/word/2016/wordml/cid" xmlns:w16="http://schemas.microsoft.com/office/word/2018/wordml" xmlns:w16sdtdh="http://schemas.microsoft.com/office/word/2020/wordml/sdtdatahash" xmlns:w16se="http://schemas.microsoft.com/office/word/2015/wordml/symex" xmlns:wpg="http://schemas.microsoft.com/office/word/2010/wordprocessingGroup" xmlns:wpi="http://schemas.microsoft.com/office/word/2010/wordprocessingInk" xmlns:wne="http://schemas.microsoft.com/office/word/2006/wordml" xmlns:wps="http://schemas.microsoft.com/office/word/2010/wordprocessingShape" mc:Ignorable="w14 w15 w16se w16cid w16 w16cex w16sdtdh wp14">
-  <w:p>
-    <w:pPr>
-      <w:pStyle w:val="Encabezado"/>
-    </w:pPr>
-  </w:p>
-</w:hdr>
-</file>
-
-<file path=word/header2.xml><?xml version="1.0" encoding="utf-8"?>
-<w:hdr xmlns:wpc="http://schemas.microsoft.com/office/word/2010/wordprocessingCanvas" xmlns:cx="http://schemas.microsoft.com/office/drawing/2014/chartex" xmlns:cx1="http://schemas.microsoft.com/office/drawing/2015/9/8/chartex" xmlns:cx2="http://schemas.microsoft.com/office/drawing/2015/10/21/chartex" xmlns:cx3="http://schemas.microsoft.com/office/drawing/2016/5/9/chartex" xmlns:cx4="http://schemas.microsoft.com/office/drawing/2016/5/10/chartex" xmlns:cx5="http://schemas.microsoft.com/office/drawing/2016/5/11/chartex" xmlns:cx6="http://schemas.microsoft.com/office/drawing/2016/5/12/chartex" xmlns:cx7="http://schemas.microsoft.com/office/drawing/2016/5/13/chartex" xmlns:cx8="http://schemas.microsoft.com/office/drawing/2016/5/14/chartex" xmlns:mc="http://schemas.openxmlformats.org/markup-compatibility/2006" xmlns:aink="http://schemas.microsoft.com/office/drawing/2016/ink" xmlns:am3d="http://schemas.microsoft.com/office/drawing/2017/model3d" xmlns:o="urn:schemas-microsoft-com:office:office" xmlns:oel="http://schemas.microsoft.com/office/2019/extlst" xmlns:r="http://schemas.openxmlformats.org/officeDocument/2006/relationships" xmlns:m="http://schemas.openxmlformats.org/officeDocument/2006/math" xmlns:v="urn:schemas-microsoft-com:vml" xmlns:wp14="http://schemas.microsoft.com/office/word/2010/wordprocessingDrawing" xmlns:wp="http://schemas.openxmlformats.org/drawingml/2006/wordprocessingDrawing" xmlns:w10="urn:schemas-microsoft-com:office:word" xmlns:w="http://schemas.openxmlformats.org/wordprocessingml/2006/main" xmlns:w14="http://schemas.microsoft.com/office/word/2010/wordml" xmlns:w15="http://schemas.microsoft.com/office/word/2012/wordml" xmlns:w16cex="http://schemas.microsoft.com/office/word/2018/wordml/cex" xmlns:w16cid="http://schemas.microsoft.com/office/word/2016/wordml/cid" xmlns:w16="http://schemas.microsoft.com/office/word/2018/wordml" xmlns:w16sdtdh="http://schemas.microsoft.com/office/word/2020/wordml/sdtdatahash" xmlns:w16se="http://schemas.microsoft.com/office/word/2015/wordml/symex" xmlns:wpg="http://schemas.microsoft.com/office/word/2010/wordprocessingGroup" xmlns:wpi="http://schemas.microsoft.com/office/word/2010/wordprocessingInk" xmlns:wne="http://schemas.microsoft.com/office/word/2006/wordml" xmlns:wps="http://schemas.microsoft.com/office/word/2010/wordprocessingShape" mc:Ignorable="w14 w15 w16se w16cid w16 w16cex w16sdtdh wp14">
-  <w:p>
-    <w:pPr>
-      <w:pStyle w:val="Encabezado"/>
-    </w:pPr>
-  </w:p>
-</w:hdr>
-</file>
-
-<file path=word/header3.xml><?xml version="1.0" encoding="utf-8"?>
-<w:hdr xmlns:wpc="http://schemas.microsoft.com/office/word/2010/wordprocessingCanvas" xmlns:cx="http://schemas.microsoft.com/office/drawing/2014/chartex" xmlns:cx1="http://schemas.microsoft.com/office/drawing/2015/9/8/chartex" xmlns:cx2="http://schemas.microsoft.com/office/drawing/2015/10/21/chartex" xmlns:cx3="http://schemas.microsoft.com/office/drawing/2016/5/9/chartex" xmlns:cx4="http://schemas.microsoft.com/office/drawing/2016/5/10/chartex" xmlns:cx5="http://schemas.microsoft.com/office/drawing/2016/5/11/chartex" xmlns:cx6="http://schemas.microsoft.com/office/drawing/2016/5/12/chartex" xmlns:cx7="http://schemas.microsoft.com/office/drawing/2016/5/13/chartex" xmlns:cx8="http://schemas.microsoft.com/office/drawing/2016/5/14/chartex" xmlns:mc="http://schemas.openxmlformats.org/markup-compatibility/2006" xmlns:aink="http://schemas.microsoft.com/office/drawing/2016/ink" xmlns:am3d="http://schemas.microsoft.com/office/drawing/2017/model3d" xmlns:o="urn:schemas-microsoft-com:office:office" xmlns:oel="http://schemas.microsoft.com/office/2019/extlst" xmlns:r="http://schemas.openxmlformats.org/officeDocument/2006/relationships" xmlns:m="http://schemas.openxmlformats.org/officeDocument/2006/math" xmlns:v="urn:schemas-microsoft-com:vml" xmlns:wp14="http://schemas.microsoft.com/office/word/2010/wordprocessingDrawing" xmlns:wp="http://schemas.openxmlformats.org/drawingml/2006/wordprocessingDrawing" xmlns:w10="urn:schemas-microsoft-com:office:word" xmlns:w="http://schemas.openxmlformats.org/wordprocessingml/2006/main" xmlns:w14="http://schemas.microsoft.com/office/word/2010/wordml" xmlns:w15="http://schemas.microsoft.com/office/word/2012/wordml" xmlns:w16cex="http://schemas.microsoft.com/office/word/2018/wordml/cex" xmlns:w16cid="http://schemas.microsoft.com/office/word/2016/wordml/cid" xmlns:w16="http://schemas.microsoft.com/office/word/2018/wordml" xmlns:w16sdtdh="http://schemas.microsoft.com/office/word/2020/wordml/sdtdatahash" xmlns:w16se="http://schemas.microsoft.com/office/word/2015/wordml/symex" xmlns:wpg="http://schemas.microsoft.com/office/word/2010/wordprocessingGroup" xmlns:wpi="http://schemas.microsoft.com/office/word/2010/wordprocessingInk" xmlns:wne="http://schemas.microsoft.com/office/word/2006/wordml" xmlns:wps="http://schemas.microsoft.com/office/word/2010/wordprocessingShape" mc:Ignorable="w14 w15 w16se w16cid w16 w16cex w16sdtdh wp14">
-  <w:p>
-    <w:pPr>
-      <w:pStyle w:val="Encabezado"/>
-    </w:pPr>
-  </w:p>
-</w:hdr>
 </file>
 
 <file path=word/styles.xml><?xml version="1.0" encoding="utf-8"?>

</xml_diff>